<commit_message>
I included a chart that summaries the types of mutagens
</commit_message>
<xml_diff>
--- a/reference.docx
+++ b/reference.docx
@@ -429,7 +429,7 @@
     <w:link w:val="Heading1Char"/>
     <w:uiPriority w:val="9"/>
     <w:qFormat/>
-    <w:rsid w:val="00917918"/>
+    <w:rsid w:val="006E1922"/>
     <w:pPr>
       <w:keepNext/>
       <w:keepLines/>
@@ -452,7 +452,7 @@
     <w:semiHidden/>
     <w:unhideWhenUsed/>
     <w:qFormat/>
-    <w:rsid w:val="00917918"/>
+    <w:rsid w:val="006E1922"/>
     <w:pPr>
       <w:keepNext/>
       <w:keepLines/>
@@ -475,7 +475,7 @@
     <w:semiHidden/>
     <w:unhideWhenUsed/>
     <w:qFormat/>
-    <w:rsid w:val="00917918"/>
+    <w:rsid w:val="006E1922"/>
     <w:pPr>
       <w:keepNext/>
       <w:keepLines/>
@@ -498,7 +498,7 @@
     <w:semiHidden/>
     <w:unhideWhenUsed/>
     <w:qFormat/>
-    <w:rsid w:val="00917918"/>
+    <w:rsid w:val="006E1922"/>
     <w:pPr>
       <w:keepNext/>
       <w:keepLines/>
@@ -521,7 +521,7 @@
     <w:semiHidden/>
     <w:unhideWhenUsed/>
     <w:qFormat/>
-    <w:rsid w:val="00917918"/>
+    <w:rsid w:val="006E1922"/>
     <w:pPr>
       <w:keepNext/>
       <w:keepLines/>
@@ -542,7 +542,7 @@
     <w:semiHidden/>
     <w:unhideWhenUsed/>
     <w:qFormat/>
-    <w:rsid w:val="00917918"/>
+    <w:rsid w:val="006E1922"/>
     <w:pPr>
       <w:keepNext/>
       <w:keepLines/>
@@ -565,7 +565,7 @@
     <w:semiHidden/>
     <w:unhideWhenUsed/>
     <w:qFormat/>
-    <w:rsid w:val="00917918"/>
+    <w:rsid w:val="006E1922"/>
     <w:pPr>
       <w:keepNext/>
       <w:keepLines/>
@@ -586,7 +586,7 @@
     <w:semiHidden/>
     <w:unhideWhenUsed/>
     <w:qFormat/>
-    <w:rsid w:val="00917918"/>
+    <w:rsid w:val="006E1922"/>
     <w:pPr>
       <w:keepNext/>
       <w:keepLines/>
@@ -609,7 +609,7 @@
     <w:semiHidden/>
     <w:unhideWhenUsed/>
     <w:qFormat/>
-    <w:rsid w:val="00917918"/>
+    <w:rsid w:val="006E1922"/>
     <w:pPr>
       <w:keepNext/>
       <w:keepLines/>
@@ -653,7 +653,7 @@
     <w:basedOn w:val="DefaultParagraphFont"/>
     <w:link w:val="Heading1"/>
     <w:uiPriority w:val="9"/>
-    <w:rsid w:val="00917918"/>
+    <w:rsid w:val="006E1922"/>
     <w:rPr>
       <w:rFonts w:asciiTheme="majorHAnsi" w:eastAsiaTheme="majorEastAsia" w:hAnsiTheme="majorHAnsi" w:cstheme="majorBidi"/>
       <w:color w:val="0F4761" w:themeColor="accent1" w:themeShade="BF"/>
@@ -667,7 +667,7 @@
     <w:link w:val="Heading2"/>
     <w:uiPriority w:val="9"/>
     <w:semiHidden/>
-    <w:rsid w:val="00917918"/>
+    <w:rsid w:val="006E1922"/>
     <w:rPr>
       <w:rFonts w:asciiTheme="majorHAnsi" w:eastAsiaTheme="majorEastAsia" w:hAnsiTheme="majorHAnsi" w:cstheme="majorBidi"/>
       <w:color w:val="0F4761" w:themeColor="accent1" w:themeShade="BF"/>
@@ -681,7 +681,7 @@
     <w:link w:val="Heading3"/>
     <w:uiPriority w:val="9"/>
     <w:semiHidden/>
-    <w:rsid w:val="00917918"/>
+    <w:rsid w:val="006E1922"/>
     <w:rPr>
       <w:rFonts w:eastAsiaTheme="majorEastAsia" w:cstheme="majorBidi"/>
       <w:color w:val="0F4761" w:themeColor="accent1" w:themeShade="BF"/>
@@ -695,7 +695,7 @@
     <w:link w:val="Heading4"/>
     <w:uiPriority w:val="9"/>
     <w:semiHidden/>
-    <w:rsid w:val="00917918"/>
+    <w:rsid w:val="006E1922"/>
     <w:rPr>
       <w:rFonts w:eastAsiaTheme="majorEastAsia" w:cstheme="majorBidi"/>
       <w:i/>
@@ -709,7 +709,7 @@
     <w:link w:val="Heading5"/>
     <w:uiPriority w:val="9"/>
     <w:semiHidden/>
-    <w:rsid w:val="00917918"/>
+    <w:rsid w:val="006E1922"/>
     <w:rPr>
       <w:rFonts w:eastAsiaTheme="majorEastAsia" w:cstheme="majorBidi"/>
       <w:color w:val="0F4761" w:themeColor="accent1" w:themeShade="BF"/>
@@ -721,7 +721,7 @@
     <w:link w:val="Heading6"/>
     <w:uiPriority w:val="9"/>
     <w:semiHidden/>
-    <w:rsid w:val="00917918"/>
+    <w:rsid w:val="006E1922"/>
     <w:rPr>
       <w:rFonts w:eastAsiaTheme="majorEastAsia" w:cstheme="majorBidi"/>
       <w:i/>
@@ -735,7 +735,7 @@
     <w:link w:val="Heading7"/>
     <w:uiPriority w:val="9"/>
     <w:semiHidden/>
-    <w:rsid w:val="00917918"/>
+    <w:rsid w:val="006E1922"/>
     <w:rPr>
       <w:rFonts w:eastAsiaTheme="majorEastAsia" w:cstheme="majorBidi"/>
       <w:color w:val="595959" w:themeColor="text1" w:themeTint="A6"/>
@@ -747,7 +747,7 @@
     <w:link w:val="Heading8"/>
     <w:uiPriority w:val="9"/>
     <w:semiHidden/>
-    <w:rsid w:val="00917918"/>
+    <w:rsid w:val="006E1922"/>
     <w:rPr>
       <w:rFonts w:eastAsiaTheme="majorEastAsia" w:cstheme="majorBidi"/>
       <w:i/>
@@ -761,7 +761,7 @@
     <w:link w:val="Heading9"/>
     <w:uiPriority w:val="9"/>
     <w:semiHidden/>
-    <w:rsid w:val="00917918"/>
+    <w:rsid w:val="006E1922"/>
     <w:rPr>
       <w:rFonts w:eastAsiaTheme="majorEastAsia" w:cstheme="majorBidi"/>
       <w:color w:val="272727" w:themeColor="text1" w:themeTint="D8"/>
@@ -774,7 +774,7 @@
     <w:link w:val="TitleChar"/>
     <w:uiPriority w:val="10"/>
     <w:qFormat/>
-    <w:rsid w:val="00917918"/>
+    <w:rsid w:val="006E1922"/>
     <w:pPr>
       <w:spacing w:after="80" w:line="240" w:lineRule="auto"/>
       <w:contextualSpacing/>
@@ -792,7 +792,7 @@
     <w:basedOn w:val="DefaultParagraphFont"/>
     <w:link w:val="Title"/>
     <w:uiPriority w:val="10"/>
-    <w:rsid w:val="00917918"/>
+    <w:rsid w:val="006E1922"/>
     <w:rPr>
       <w:rFonts w:asciiTheme="majorHAnsi" w:eastAsiaTheme="majorEastAsia" w:hAnsiTheme="majorHAnsi" w:cstheme="majorBidi"/>
       <w:spacing w:val="-10"/>
@@ -808,7 +808,7 @@
     <w:link w:val="SubtitleChar"/>
     <w:uiPriority w:val="11"/>
     <w:qFormat/>
-    <w:rsid w:val="00917918"/>
+    <w:rsid w:val="006E1922"/>
     <w:pPr>
       <w:numPr>
         <w:ilvl w:val="1"/>
@@ -827,7 +827,7 @@
     <w:basedOn w:val="DefaultParagraphFont"/>
     <w:link w:val="Subtitle"/>
     <w:uiPriority w:val="11"/>
-    <w:rsid w:val="00917918"/>
+    <w:rsid w:val="006E1922"/>
     <w:rPr>
       <w:rFonts w:eastAsiaTheme="majorEastAsia" w:cstheme="majorBidi"/>
       <w:color w:val="595959" w:themeColor="text1" w:themeTint="A6"/>
@@ -843,7 +843,7 @@
     <w:link w:val="QuoteChar"/>
     <w:uiPriority w:val="29"/>
     <w:qFormat/>
-    <w:rsid w:val="00917918"/>
+    <w:rsid w:val="006E1922"/>
     <w:pPr>
       <w:spacing w:before="160"/>
       <w:jc w:val="center"/>
@@ -859,7 +859,7 @@
     <w:basedOn w:val="DefaultParagraphFont"/>
     <w:link w:val="Quote"/>
     <w:uiPriority w:val="29"/>
-    <w:rsid w:val="00917918"/>
+    <w:rsid w:val="006E1922"/>
     <w:rPr>
       <w:i/>
       <w:iCs/>
@@ -871,7 +871,7 @@
     <w:basedOn w:val="Normal"/>
     <w:uiPriority w:val="34"/>
     <w:qFormat/>
-    <w:rsid w:val="00917918"/>
+    <w:rsid w:val="006E1922"/>
     <w:pPr>
       <w:ind w:left="720"/>
       <w:contextualSpacing/>
@@ -882,7 +882,7 @@
     <w:basedOn w:val="DefaultParagraphFont"/>
     <w:uiPriority w:val="21"/>
     <w:qFormat/>
-    <w:rsid w:val="00917918"/>
+    <w:rsid w:val="006E1922"/>
     <w:rPr>
       <w:i/>
       <w:iCs/>
@@ -896,7 +896,7 @@
     <w:link w:val="IntenseQuoteChar"/>
     <w:uiPriority w:val="30"/>
     <w:qFormat/>
-    <w:rsid w:val="00917918"/>
+    <w:rsid w:val="006E1922"/>
     <w:pPr>
       <w:pBdr>
         <w:top w:val="single" w:sz="4" w:space="10" w:color="0F4761" w:themeColor="accent1" w:themeShade="BF"/>
@@ -917,7 +917,7 @@
     <w:basedOn w:val="DefaultParagraphFont"/>
     <w:link w:val="IntenseQuote"/>
     <w:uiPriority w:val="30"/>
-    <w:rsid w:val="00917918"/>
+    <w:rsid w:val="006E1922"/>
     <w:rPr>
       <w:i/>
       <w:iCs/>
@@ -929,7 +929,7 @@
     <w:basedOn w:val="DefaultParagraphFont"/>
     <w:uiPriority w:val="32"/>
     <w:qFormat/>
-    <w:rsid w:val="00917918"/>
+    <w:rsid w:val="006E1922"/>
     <w:rPr>
       <w:b/>
       <w:bCs/>

</xml_diff>